<commit_message>
docs: clarify reported KPI 1 completion and public evidence scope
</commit_message>
<xml_diff>
--- a/docs/evidence/fierce-kpi-evidence.en.docx
+++ b/docs/evidence/fierce-kpi-evidence.en.docx
@@ -7,7 +7,7 @@
         <w:pStyle w:val="Title"/>
       </w:pPr>
       <w:r>
-        <w:t>FIERCE — Evidence Report for DEPOSIUM GeoAI Deliveries</w:t>
+        <w:t>FIERCE — Public Technical KPI Annex for DEPOSIUM GeoAI</w:t>
       </w:r>
     </w:p>
     <w:p>
@@ -35,19 +35,29 @@
       </w:r>
     </w:p>
     <w:p>
-      <w:r/>
       <w:r>
         <w:rPr>
           <w:b/>
         </w:rPr>
-        <w:t>Document status as of:</w:t>
+        <w:t>Technical evidence cutoff:</w:t>
       </w:r>
       <w:r>
         <w:t xml:space="preserve"> 28 October 2026</w:t>
       </w:r>
     </w:p>
     <w:p>
-      <w:r/>
+      <w:pPr/>
+      <w:r>
+        <w:rPr>
+          <w:b/>
+        </w:rPr>
+        <w:t>KPI 1 reporting clarification:</w:t>
+      </w:r>
+      <w:r>
+        <w:t xml:space="preserve"> 30 October 2026, using the Milestone 2 project report dated 29 October 2026.</w:t>
+      </w:r>
+    </w:p>
+    <w:p>
       <w:r>
         <w:rPr>
           <w:b/>
@@ -55,7 +65,7 @@
         <w:t>Purpose:</w:t>
       </w:r>
       <w:r>
-        <w:t xml:space="preserve"> link each KPI in the Transformation Plan to verifiable deliverables, results and supporting evidence.</w:t>
+        <w:t xml:space="preserve"> provide the public technical evidence supporting the Milestone 2 project report, with an explicitly scoped summary of reported KPI 1 completion.</w:t>
       </w:r>
     </w:p>
     <w:p>
@@ -68,7 +78,7 @@
     </w:p>
     <w:p>
       <w:r>
-        <w:t xml:space="preserve">This is a public adaptation of the English FIERCE evidence report dated 28 October 2026. The original report file was recorded at source-report commit </w:t>
+        <w:t xml:space="preserve">The technical part of this annex adapts the English FIERCE evidence report dated 28 October 2026. The original report file was recorded at source-report commit </w:t>
       </w:r>
       <w:r>
         <w:rPr>
@@ -101,6 +111,39 @@
     <w:p>
       <w:r>
         <w:t>Targets below are transcribed from the supplied FIERCE Transformation Plan: deliverables and KPIs on pages 8–9, impact contributions on page 11, and maturity targets on page 2. The contractual originals and commercial materials are not published here. This report does not certify the adapted scope's conformity with the original plan.</w:t>
+      </w:r>
+    </w:p>
+    <w:p>
+      <w:pPr/>
+      <w:r>
+        <w:t xml:space="preserve">The confidential </w:t>
+      </w:r>
+      <w:r>
+        <w:rPr>
+          <w:b/>
+        </w:rPr>
+        <w:t>Milestone 2 project report</w:t>
+      </w:r>
+      <w:r>
+        <w:t xml:space="preserve"> is the overall project account. This </w:t>
+      </w:r>
+      <w:r>
+        <w:rPr>
+          <w:b/>
+        </w:rPr>
+        <w:t>public technical annex</w:t>
+      </w:r>
+      <w:r>
+        <w:t xml:space="preserve"> explains the KPI mapping and links to selected technical proofs. The individual </w:t>
+      </w:r>
+      <w:r>
+        <w:rPr>
+          <w:b/>
+        </w:rPr>
+        <w:t>evidence excerpts and records</w:t>
+      </w:r>
+      <w:r>
+        <w:t xml:space="preserve"> document those cited results and decisions. These are complementary documents; the public annex is not the full milestone report or its commercial evidence package.</w:t>
       </w:r>
     </w:p>
     <w:p>
@@ -275,20 +318,9 @@
           <w:p>
             <w:r>
               <w:rPr>
-                <w:sz w:val="18"/>
-              </w:rPr>
-            </w:r>
-            <w:r>
-              <w:rPr>
                 <w:b/>
-                <w:sz w:val="18"/>
               </w:rPr>
               <w:t>1 — Commercial validation / D1</w:t>
-            </w:r>
-            <w:r>
-              <w:rPr>
-                <w:sz w:val="18"/>
-              </w:rPr>
             </w:r>
           </w:p>
         </w:tc>
@@ -298,9 +330,6 @@
           </w:tcPr>
           <w:p>
             <w:r>
-              <w:rPr>
-                <w:sz w:val="18"/>
-              </w:rPr>
               <w:t>5/5 service components</w:t>
             </w:r>
           </w:p>
@@ -312,9 +341,12 @@
           <w:p>
             <w:r>
               <w:rPr>
-                <w:sz w:val="18"/>
+                <w:b/>
               </w:rPr>
-              <w:t>The market-study outputs are not audited in these technical repositories.</w:t>
+              <w:t>5/5 reported completed</w:t>
+            </w:r>
+            <w:r>
+              <w:t xml:space="preserve"> in the 29 October 2026 Milestone 2 report.</w:t>
             </w:r>
           </w:p>
         </w:tc>
@@ -324,10 +356,7 @@
           </w:tcPr>
           <w:p>
             <w:r>
-              <w:rPr>
-                <w:sz w:val="18"/>
-              </w:rPr>
-              <w:t>Attach the CLELYA/Amandine deliverables; do not infer commercial results from code.</w:t>
+              <w:t>0/5 is the baseline. Confidential D1 materials are referenced separately; fundraising preparation is not capital raised. See section 3.</w:t>
             </w:r>
           </w:p>
         </w:tc>
@@ -815,29 +844,132 @@
       </w:r>
     </w:p>
     <w:p>
-      <w:r/>
       <w:r>
         <w:rPr>
           <w:b/>
         </w:rPr>
         <w:t>Responsibility for documentation: CLELYA Conseil, Amandine and Deposium coordination.</w:t>
       </w:r>
-      <w:r>
-        <w:t xml:space="preserve"> The five sets of supporting materials to attach are: the market study; a synthesis of the 15 announced interviews; pricing and revenue-model recommendations; the go-to-market strategy; and fundraising preparation.</w:t>
-      </w:r>
     </w:p>
     <w:p>
+      <w:pPr/>
       <w:r>
-        <w:t xml:space="preserve">Interviews and potential pilot opportunities can explain the intended uses. They do not establish delivery of these five sets of materials. </w:t>
+        <w:rPr>
+          <w:b/>
+        </w:rPr>
+        <w:t>Metric and reported result.</w:t>
+      </w:r>
+      <w:r>
+        <w:t xml:space="preserve"> The Milestone 2 project report dated 29 October 2026, section 2.2 (KPI table), records a </w:t>
       </w:r>
       <w:r>
         <w:rPr>
           <w:b/>
         </w:rPr>
-        <w:t>This report assigns neither 0/5 nor 5/5 to this KPI</w:t>
+        <w:t>baseline of 0/5 service components</w:t>
       </w:r>
       <w:r>
-        <w:t>: it identifies the required business evidence, outside the repository audit.</w:t>
+        <w:t xml:space="preserve">, a </w:t>
+      </w:r>
+      <w:r>
+        <w:rPr>
+          <w:b/>
+        </w:rPr>
+        <w:t>target of 5/5</w:t>
+      </w:r>
+      <w:r>
+        <w:t xml:space="preserve"> and an </w:t>
+      </w:r>
+      <w:r>
+        <w:rPr>
+          <w:b/>
+        </w:rPr>
+        <w:t>achieved result of 5/5</w:t>
+      </w:r>
+      <w:r>
+        <w:t>. The metric is completion of five commercial-validation service components:</w:t>
+      </w:r>
+    </w:p>
+    <w:p>
+      <w:pPr>
+        <w:pStyle w:val="ListBullet"/>
+      </w:pPr>
+      <w:r>
+        <w:t>Market analysis.</w:t>
+      </w:r>
+    </w:p>
+    <w:p>
+      <w:pPr>
+        <w:pStyle w:val="ListBullet"/>
+      </w:pPr>
+      <w:r>
+        <w:t xml:space="preserve">Field research and interview synthesis: </w:t>
+      </w:r>
+      <w:r>
+        <w:rPr>
+          <w:b/>
+        </w:rPr>
+        <w:t>15 qualitative interviews with 13 organisations</w:t>
+      </w:r>
+      <w:r>
+        <w:t>, as reported in the milestone report.</w:t>
+      </w:r>
+    </w:p>
+    <w:p>
+      <w:pPr>
+        <w:pStyle w:val="ListBullet"/>
+      </w:pPr>
+      <w:r>
+        <w:t>Revenue-model and pricing recommendations.</w:t>
+      </w:r>
+    </w:p>
+    <w:p>
+      <w:pPr>
+        <w:pStyle w:val="ListBullet"/>
+      </w:pPr>
+      <w:r>
+        <w:t>Go-to-market strategy and a 24-month roadmap.</w:t>
+      </w:r>
+    </w:p>
+    <w:p>
+      <w:pPr>
+        <w:pStyle w:val="ListBullet"/>
+      </w:pPr>
+      <w:r>
+        <w:t>Fundraising preparation: financing plan, investor targeting, investor Q&amp;A and data-room preparation.</w:t>
+      </w:r>
+    </w:p>
+    <w:p>
+      <w:pPr/>
+      <w:r>
+        <w:rPr>
+          <w:b/>
+        </w:rPr>
+        <w:t>Fundraising boundary.</w:t>
+      </w:r>
+      <w:r>
+        <w:t xml:space="preserve"> This fifth component measures preparation for fundraising. It does not measure capital raised or a completed investment round. The milestone report identifies investor meetings as a next step. Similarly, the interview count is not a count of paying customers, signed pilots or purchase commitments.</w:t>
+      </w:r>
+    </w:p>
+    <w:p>
+      <w:pPr/>
+      <w:r>
+        <w:rPr>
+          <w:b/>
+        </w:rPr>
+        <w:t>Evidence boundary.</w:t>
+      </w:r>
+      <w:r>
+        <w:t xml:space="preserve"> The confidential D1 business materials are referenced in the milestone report's sections 2.1 (D1 deliverable) and 2.2 (KPI 1). This public annex records the project's </w:t>
+      </w:r>
+      <w:r>
+        <w:rPr>
+          <w:b/>
+        </w:rPr>
+        <w:t>reported completion</w:t>
+      </w:r>
+      <w:r>
+        <w:t>; it does not independently audit those materials or establish external FIERCE acceptance. Private links, interview reports and commercial documents are not reproduced here. Their absence from the public repository is not a result of zero interviews or zero delivered service components.</w:t>
       </w:r>
     </w:p>
     <w:p>
@@ -3758,7 +3890,7 @@
         <w:pStyle w:val="Heading1"/>
       </w:pPr>
       <w:r>
-        <w:t>10. Materials to assemble for submission</w:t>
+        <w:t>10. Submission materials and evidence locations</w:t>
       </w:r>
     </w:p>
     <w:tbl>
@@ -3808,10 +3940,7 @@
           </w:tcPr>
           <w:p>
             <w:r>
-              <w:rPr>
-                <w:sz w:val="18"/>
-              </w:rPr>
-              <w:t>Expected content</w:t>
+              <w:t>Content and evidence location</w:t>
             </w:r>
           </w:p>
         </w:tc>
@@ -3823,9 +3952,6 @@
           </w:tcPr>
           <w:p>
             <w:r>
-              <w:rPr>
-                <w:sz w:val="18"/>
-              </w:rPr>
               <w:t>D1 commercial study and readiness</w:t>
             </w:r>
           </w:p>
@@ -3836,9 +3962,6 @@
           </w:tcPr>
           <w:p>
             <w:r>
-              <w:rPr>
-                <w:sz w:val="18"/>
-              </w:rPr>
               <w:t>CLELYA / Amandine / Nicolas</w:t>
             </w:r>
           </w:p>
@@ -3849,10 +3972,7 @@
           </w:tcPr>
           <w:p>
             <w:r>
-              <w:rPr>
-                <w:sz w:val="18"/>
-              </w:rPr>
-              <w:t>The five sets of materials for KPI 1, including the list and synthesis of interviews actually conducted.</w:t>
+              <w:t>Five service components reported completed (5/5) in the 29 October milestone report. The confidential supporting materials are referenced there, in sections 2.1 and 2.2; they are outside this public annex.</w:t>
             </w:r>
           </w:p>
         </w:tc>

</xml_diff>